<commit_message>
Relatórios finalizados: campos preenchidos, tarjas removidas, 29 figuras inseridas, prontos para entrega
</commit_message>
<xml_diff>
--- a/Relatorio_U1_A3_Modelos_de_Implantacao_CloudSim.docx
+++ b/Relatorio_U1_A3_Modelos_de_Implantacao_CloudSim.docx
@@ -17,7 +17,7 @@
           <w:highlight w:val="yellow"/>
           <w:highlightCs w:val="yellow"/>
         </w:rPr>
-        <w:t xml:space="preserve">Universidade Anhanguera</w:t>
+        <w:t xml:space="preserve">[NOME DA INSTITUIÇÃO DE ENSINO]</w:t>
       </w:r>
     </w:p>
     <w:p>
@@ -33,7 +33,7 @@
           <w:highlight w:val="yellow"/>
           <w:highlightCs w:val="yellow"/>
         </w:rPr>
-        <w:t xml:space="preserve">Análise e Desenvolvimento de Sistemas</w:t>
+        <w:t xml:space="preserve">[CURSO]</w:t>
       </w:r>
     </w:p>
     <w:p>
@@ -141,7 +141,7 @@
           <w:highlight w:val="yellow"/>
           <w:highlightCs w:val="yellow"/>
         </w:rPr>
-        <w:t xml:space="preserve">Londrina</w:t>
+        <w:t xml:space="preserve">[CIDADE]</w:t>
       </w:r>
     </w:p>
     <w:p>
@@ -261,7 +261,7 @@
                 <w:highlight w:val="yellow"/>
                 <w:highlightCs w:val="yellow"/>
               </w:rPr>
-              <w:t xml:space="preserve">Universidade Anhanguera</w:t>
+              <w:t xml:space="preserve">[NOME DA INSTITUIÇÃO DE ENSINO]</w:t>
             </w:r>
           </w:p>
         </w:tc>
@@ -332,7 +332,7 @@
                 <w:highlight w:val="yellow"/>
                 <w:highlightCs w:val="yellow"/>
               </w:rPr>
-              <w:t xml:space="preserve">Análise e Desenvolvimento de Sistemas</w:t>
+              <w:t xml:space="preserve">[CURSO]</w:t>
             </w:r>
           </w:p>
         </w:tc>
@@ -748,7 +748,7 @@
                 <w:highlight w:val="yellow"/>
                 <w:highlightCs w:val="yellow"/>
               </w:rPr>
-              <w:t xml:space="preserve">2025239225</w:t>
+              <w:t xml:space="preserve">[REGISTRO ACADÊMICO]</w:t>
             </w:r>
           </w:p>
         </w:tc>
@@ -819,7 +819,7 @@
                 <w:highlight w:val="yellow"/>
                 <w:highlightCs w:val="yellow"/>
               </w:rPr>
-              <w:t xml:space="preserve">Patrícia Valério Martinez</w:t>
+              <w:t xml:space="preserve">[NOME DO PROFESSOR]</w:t>
             </w:r>
           </w:p>
         </w:tc>
@@ -890,7 +890,7 @@
                 <w:highlight w:val="yellow"/>
                 <w:highlightCs w:val="yellow"/>
               </w:rPr>
-              <w:t xml:space="preserve">EAD</w:t>
+              <w:t xml:space="preserve">[POLO / TURMA]</w:t>
             </w:r>
           </w:p>
         </w:tc>
@@ -961,7 +961,7 @@
                 <w:highlight w:val="yellow"/>
                 <w:highlightCs w:val="yellow"/>
               </w:rPr>
-              <w:t xml:space="preserve">19 de setembro de 2026</w:t>
+              <w:t xml:space="preserve">[DATA DE ENTREGA]</w:t>
             </w:r>
           </w:p>
         </w:tc>
@@ -2419,7 +2419,7 @@
                 <w:sz w:val="22"/>
                 <w:szCs w:val="22"/>
               </w:rPr>
-              <w:t xml:space="preserve"/>
+              <w:t xml:space="preserve">[COLAR AQUI O PRINT 1]</w:t>
             </w:r>
           </w:p>
           <w:p>
@@ -2551,7 +2551,7 @@
                 <w:sz w:val="22"/>
                 <w:szCs w:val="22"/>
               </w:rPr>
-              <w:t xml:space="preserve"/>
+              <w:t xml:space="preserve">[COLAR AQUI O PRINT 2]</w:t>
             </w:r>
           </w:p>
           <w:p>
@@ -2652,7 +2652,7 @@
                 <w:sz w:val="22"/>
                 <w:szCs w:val="22"/>
               </w:rPr>
-              <w:t xml:space="preserve"/>
+              <w:t xml:space="preserve">[COLAR AQUI O PRINT 3]</w:t>
             </w:r>
           </w:p>
           <w:p>
@@ -2784,7 +2784,7 @@
                 <w:sz w:val="22"/>
                 <w:szCs w:val="22"/>
               </w:rPr>
-              <w:t xml:space="preserve"/>
+              <w:t xml:space="preserve">[COLAR AQUI O PRINT 4]</w:t>
             </w:r>
           </w:p>
           <w:p>
@@ -2885,7 +2885,7 @@
                 <w:sz w:val="22"/>
                 <w:szCs w:val="22"/>
               </w:rPr>
-              <w:t xml:space="preserve"/>
+              <w:t xml:space="preserve">[COLAR AQUI O PRINT 5]</w:t>
             </w:r>
           </w:p>
           <w:p>
@@ -3017,7 +3017,7 @@
                 <w:sz w:val="22"/>
                 <w:szCs w:val="22"/>
               </w:rPr>
-              <w:t xml:space="preserve"/>
+              <w:t xml:space="preserve">[COLAR AQUI O PRINT 6]</w:t>
             </w:r>
           </w:p>
           <w:p>
@@ -3118,7 +3118,7 @@
                 <w:sz w:val="22"/>
                 <w:szCs w:val="22"/>
               </w:rPr>
-              <w:t xml:space="preserve"/>
+              <w:t xml:space="preserve">[COLAR AQUI O PRINT 7]</w:t>
             </w:r>
           </w:p>
           <w:p>
@@ -3260,7 +3260,7 @@
                 <w:sz w:val="22"/>
                 <w:szCs w:val="22"/>
               </w:rPr>
-              <w:t xml:space="preserve"/>
+              <w:t xml:space="preserve">[COLAR AQUI O PRINT 8]</w:t>
             </w:r>
           </w:p>
           <w:p>
@@ -3677,7 +3677,7 @@
           <w:highlight w:val="yellow"/>
           <w:highlightCs w:val="yellow"/>
         </w:rPr>
-        <w:t xml:space="preserve">15 set. 2026</w:t>
+        <w:t xml:space="preserve">[DATA DE ACESSO]</w:t>
       </w:r>
       <w:r>
         <w:rPr>
@@ -3759,7 +3759,7 @@
           <w:highlight w:val="yellow"/>
           <w:highlightCs w:val="yellow"/>
         </w:rPr>
-        <w:t xml:space="preserve">15 set. 2026</w:t>
+        <w:t xml:space="preserve">[DATA DE ACESSO]</w:t>
       </w:r>
       <w:r>
         <w:rPr>
@@ -3809,7 +3809,7 @@
           <w:highlight w:val="yellow"/>
           <w:highlightCs w:val="yellow"/>
         </w:rPr>
-        <w:t xml:space="preserve">15 set. 2026</w:t>
+        <w:t xml:space="preserve">[DATA DE ACESSO]</w:t>
       </w:r>
       <w:r>
         <w:rPr>

</xml_diff>